<commit_message>
History: regenerate the Prehistory/Xia write-up docx
Co-Authored-By: Claude Opus 5.5 <noreply@anthropic.com>
Claude-Session: https://claude.ai/code/session_01Ji6DypJAAxMXpZUwS3PViR
</commit_message>
<xml_diff>
--- a/history/notes/02_prehistory_xia_writeup.docx
+++ b/history/notes/02_prehistory_xia_writeup.docx
@@ -112,6 +112,22 @@
     <w:p>
       <w:r>
         <w:rPr>
+          <w:i/>
+        </w:rPr>
+        <w:t>Fact-checked 10-05: Zdansky (not Andersson) found the first Peking Man teeth; the</w:t>
+      </w:r>
+      <w:r>
+        <w:t xml:space="preserve"> Bamboo Annals *were found in 279 AD;</w:t>
+      </w:r>
+    </w:p>
+    <w:p>
+      <w:r>
+        <w:t>the Thera link is Kevin Pang's; Jinsha's mask is not "smiling"; Zhangzhung fell c. 644.*</w:t>
+      </w:r>
+    </w:p>
+    <w:p>
+      <w:r>
+        <w:rPr>
           <w:b/>
           <w:u w:val="single"/>
         </w:rPr>
@@ -444,7 +460,16 @@
         <w:t>Johan Gunnar Andersson</w:t>
       </w:r>
       <w:r>
-        <w:t xml:space="preserve"> first found teeth there (1921). The 1920s–30s digs were under </w:t>
+        <w:t xml:space="preserve"> found the site in 1921 and sent his assistant </w:t>
+      </w:r>
+      <w:r>
+        <w:rPr>
+          <w:b/>
+        </w:rPr>
+        <w:t>Otto Zdansky</w:t>
+      </w:r>
+      <w:r>
+        <w:t xml:space="preserve">, who dug up the first two teeth (1921, 1923); Andersson announced them in 1926. The 1920s–30s digs were under </w:t>
       </w:r>
       <w:r>
         <w:rPr>
@@ -2101,7 +2126,7 @@
         <w:t>independently</w:t>
       </w:r>
       <w:r>
-        <w:t xml:space="preserve"> of the Shang style and knew nothing of writing.</w:t>
+        <w:t xml:space="preserve"> of the Shang style and has left no writing.</w:t>
       </w:r>
     </w:p>
     <w:p>
@@ -2133,7 +2158,7 @@
         <w:rPr>
           <w:b/>
         </w:rPr>
-        <w:t>smiling gold mask</w:t>
+        <w:t>gold mask</w:t>
       </w:r>
       <w:r>
         <w:t>.</w:t>
@@ -2150,7 +2175,7 @@
         <w:t>Zhangzhung</w:t>
       </w:r>
       <w:r>
-        <w:t xml:space="preserve"> (c. 500 BC–625 AD) — the kingdom of </w:t>
+        <w:t xml:space="preserve"> (c. 500 BC–7th century AD) — the kingdom of </w:t>
       </w:r>
       <w:r>
         <w:rPr>
@@ -2177,7 +2202,7 @@
         <w:t>Songtsen Gampo</w:t>
       </w:r>
       <w:r>
-        <w:t xml:space="preserve">, founder of the </w:t>
+        <w:t xml:space="preserve"> (c. 644), founder of the </w:t>
       </w:r>
       <w:r>
         <w:rPr>
@@ -2307,25 +2332,25 @@
         <w:rPr>
           <w:i/>
         </w:rPr>
-        <w:t>281 AD</w:t>
+        <w:t>279 AD</w:t>
       </w:r>
       <w:r>
         <w:rPr>
           <w:i/>
         </w:rPr>
-        <w:t xml:space="preserve"> in the tomb of a Warring States king of </w:t>
+        <w:t xml:space="preserve"> (the Jizhong find; some sources say 281) in the tomb of </w:t>
       </w:r>
       <w:r>
         <w:rPr>
           <w:i/>
         </w:rPr>
-        <w:t>Wei</w:t>
+        <w:t>King Xiang of Wei</w:t>
       </w:r>
       <w:r>
         <w:rPr>
           <w:i/>
         </w:rPr>
-        <w:t xml:space="preserve">. </w:t>
+        <w:t xml:space="preserve"> (d. 296 BC). </w:t>
       </w:r>
       <w:r>
         <w:rPr>
@@ -2847,7 +2872,16 @@
         <w:t>a yellow fog, a dim sun, three suns, frost in summer</w:t>
       </w:r>
       <w:r>
-        <w:t xml:space="preserve">) have been linked by Robert Ritner and others to the </w:t>
+        <w:t xml:space="preserve">) have been linked by the JPL scientist </w:t>
+      </w:r>
+      <w:r>
+        <w:rPr>
+          <w:b/>
+        </w:rPr>
+        <w:t>Kevin Pang</w:t>
+      </w:r>
+      <w:r>
+        <w:t xml:space="preserve"> and others to the </w:t>
       </w:r>
       <w:r>
         <w:rPr>

</xml_diff>